<commit_message>
Add overviews, new project, new images
</commit_message>
<xml_diff>
--- a/public/resume/Kamil-Bozkurt-Resume-ATS.docx
+++ b/public/resume/Kamil-Bozkurt-Resume-ATS.docx
@@ -49,7 +49,7 @@
           <w:sz w:val="20"/>
           <w:szCs w:val="20"/>
         </w:rPr>
-        <w:t xml:space="preserve"> Personal Website |  </w:t>
+        <w:t xml:space="preserve"> </w:t>
       </w:r>
       <w:r>
         <w:rPr>
@@ -73,7 +73,7 @@
           <w:sz w:val="20"/>
           <w:szCs w:val="20"/>
         </w:rPr>
-        <w:t>+1 (778) 389 5816</w:t>
+        <w:t>www.linkedin.com/in/kamil-bozkurt</w:t>
       </w:r>
       <w:r>
         <w:rPr>
@@ -83,14 +83,17 @@
         </w:rPr>
         <w:t xml:space="preserve"> | </w:t>
       </w:r>
-      <w:r>
-        <w:rPr>
-          <w:rFonts w:ascii="Arial" w:eastAsia="Arial" w:hAnsi="Arial"/>
-          <w:sz w:val="20"/>
-          <w:szCs w:val="20"/>
-        </w:rPr>
-        <w:t>www.linkedin.com/in/kamil-bozkurt</w:t>
-      </w:r>
+      <w:hyperlink r:id="rId7" w:history="1">
+        <w:r>
+          <w:rPr>
+            <w:rStyle w:val="Kpr"/>
+            <w:rFonts w:ascii="Arial" w:eastAsia="Arial" w:hAnsi="Arial"/>
+            <w:sz w:val="20"/>
+            <w:szCs w:val="20"/>
+          </w:rPr>
+          <w:t>https://github.com/KamilBozz</w:t>
+        </w:r>
+      </w:hyperlink>
       <w:r>
         <w:rPr>
           <w:rFonts w:ascii="Arial" w:eastAsia="Arial" w:hAnsi="Arial"/>
@@ -105,7 +108,7 @@
           <w:sz w:val="20"/>
           <w:szCs w:val="20"/>
         </w:rPr>
-        <w:t>https://github.com/KamilBozz</w:t>
+        <w:t>https://www.kamilbozkurt.com/</w:t>
       </w:r>
     </w:p>
     <w:p>
@@ -525,13 +528,41 @@
           <w:szCs w:val="20"/>
         </w:rPr>
       </w:pPr>
-      <w:r>
-        <w:rPr>
-          <w:rFonts w:ascii="Arial" w:eastAsia="Arial" w:hAnsi="Arial"/>
-          <w:sz w:val="20"/>
-          <w:szCs w:val="20"/>
-        </w:rPr>
-        <w:t>Vercel, Render, Ngrok, Aiven</w:t>
+      <w:proofErr w:type="spellStart"/>
+      <w:r>
+        <w:rPr>
+          <w:rFonts w:ascii="Arial" w:eastAsia="Arial" w:hAnsi="Arial"/>
+          <w:sz w:val="20"/>
+          <w:szCs w:val="20"/>
+        </w:rPr>
+        <w:t>Vercel</w:t>
+      </w:r>
+      <w:proofErr w:type="spellEnd"/>
+      <w:r>
+        <w:rPr>
+          <w:rFonts w:ascii="Arial" w:eastAsia="Arial" w:hAnsi="Arial"/>
+          <w:sz w:val="20"/>
+          <w:szCs w:val="20"/>
+        </w:rPr>
+        <w:t xml:space="preserve">, Render, </w:t>
+      </w:r>
+      <w:proofErr w:type="spellStart"/>
+      <w:r>
+        <w:rPr>
+          <w:rFonts w:ascii="Arial" w:eastAsia="Arial" w:hAnsi="Arial"/>
+          <w:sz w:val="20"/>
+          <w:szCs w:val="20"/>
+        </w:rPr>
+        <w:t>Ngrok</w:t>
+      </w:r>
+      <w:proofErr w:type="spellEnd"/>
+      <w:r>
+        <w:rPr>
+          <w:rFonts w:ascii="Arial" w:eastAsia="Arial" w:hAnsi="Arial"/>
+          <w:sz w:val="20"/>
+          <w:szCs w:val="20"/>
+        </w:rPr>
+        <w:t>, Aiven</w:t>
       </w:r>
     </w:p>
     <w:p>
@@ -1114,7 +1145,7 @@
         </w:rPr>
         <w:t xml:space="preserve">GitHub: </w:t>
       </w:r>
-      <w:hyperlink r:id="rId7" w:tgtFrame="_new" w:history="1">
+      <w:hyperlink r:id="rId8" w:tgtFrame="_new" w:history="1">
         <w:r>
           <w:rPr>
             <w:rStyle w:val="Kpr"/>
@@ -1134,7 +1165,7 @@
         <w:br/>
         <w:t xml:space="preserve">Live App: </w:t>
       </w:r>
-      <w:hyperlink r:id="rId8" w:tgtFrame="_new" w:history="1">
+      <w:hyperlink r:id="rId9" w:tgtFrame="_new" w:history="1">
         <w:r>
           <w:rPr>
             <w:rStyle w:val="Kpr"/>
@@ -1161,7 +1192,25 @@
           <w:sz w:val="20"/>
           <w:szCs w:val="20"/>
         </w:rPr>
-        <w:t>Contributed to approximately 80% of the application by building core features including Leaderboard, Friends system, User Profile, and major Home dashboard components.</w:t>
+        <w:t xml:space="preserve">Contributed to approximately 80% of the application by building core features including Leaderboard, Friends system, User Profile, and major </w:t>
+      </w:r>
+      <w:proofErr w:type="gramStart"/>
+      <w:r>
+        <w:rPr>
+          <w:rFonts w:ascii="Arial" w:eastAsia="Arial" w:hAnsi="Arial"/>
+          <w:sz w:val="20"/>
+          <w:szCs w:val="20"/>
+        </w:rPr>
+        <w:t>Home</w:t>
+      </w:r>
+      <w:proofErr w:type="gramEnd"/>
+      <w:r>
+        <w:rPr>
+          <w:rFonts w:ascii="Arial" w:eastAsia="Arial" w:hAnsi="Arial"/>
+          <w:sz w:val="20"/>
+          <w:szCs w:val="20"/>
+        </w:rPr>
+        <w:t xml:space="preserve"> dashboard components.</w:t>
       </w:r>
     </w:p>
     <w:p>
@@ -1184,7 +1233,25 @@
           <w:sz w:val="20"/>
           <w:szCs w:val="20"/>
         </w:rPr>
-        <w:t>Developed complex UI and data flows using React, TypeScript, Vite, and TanStack Query to manage server-state efficiently.</w:t>
+        <w:t xml:space="preserve">Developed complex UI and data flows using React, TypeScript, Vite, and </w:t>
+      </w:r>
+      <w:proofErr w:type="spellStart"/>
+      <w:r>
+        <w:rPr>
+          <w:rFonts w:ascii="Arial" w:eastAsia="Arial" w:hAnsi="Arial"/>
+          <w:sz w:val="20"/>
+          <w:szCs w:val="20"/>
+        </w:rPr>
+        <w:t>TanStack</w:t>
+      </w:r>
+      <w:proofErr w:type="spellEnd"/>
+      <w:r>
+        <w:rPr>
+          <w:rFonts w:ascii="Arial" w:eastAsia="Arial" w:hAnsi="Arial"/>
+          <w:sz w:val="20"/>
+          <w:szCs w:val="20"/>
+        </w:rPr>
+        <w:t xml:space="preserve"> Query to manage server-state efficiently.</w:t>
       </w:r>
     </w:p>
     <w:p>
@@ -1253,7 +1320,25 @@
           <w:sz w:val="20"/>
           <w:szCs w:val="20"/>
         </w:rPr>
-        <w:t>Integrated Clerk authentication via Ngrok to support secure onboarding and user management.</w:t>
+        <w:t xml:space="preserve">Integrated Clerk authentication via </w:t>
+      </w:r>
+      <w:proofErr w:type="spellStart"/>
+      <w:r>
+        <w:rPr>
+          <w:rFonts w:asciiTheme="majorHAnsi" w:hAnsiTheme="majorHAnsi" w:cstheme="majorHAnsi"/>
+          <w:sz w:val="20"/>
+          <w:szCs w:val="20"/>
+        </w:rPr>
+        <w:t>Ngrok</w:t>
+      </w:r>
+      <w:proofErr w:type="spellEnd"/>
+      <w:r>
+        <w:rPr>
+          <w:rFonts w:asciiTheme="majorHAnsi" w:hAnsiTheme="majorHAnsi" w:cstheme="majorHAnsi"/>
+          <w:sz w:val="20"/>
+          <w:szCs w:val="20"/>
+        </w:rPr>
+        <w:t xml:space="preserve"> to support secure onboarding and user management.</w:t>
       </w:r>
     </w:p>
     <w:p>
@@ -1431,7 +1516,7 @@
         </w:rPr>
         <w:t xml:space="preserve">GitHub: </w:t>
       </w:r>
-      <w:hyperlink r:id="rId9" w:tgtFrame="_new" w:history="1">
+      <w:hyperlink r:id="rId10" w:tgtFrame="_new" w:history="1">
         <w:r>
           <w:rPr>
             <w:rStyle w:val="Kpr"/>
@@ -1451,7 +1536,7 @@
         <w:br/>
         <w:t xml:space="preserve">Live App: </w:t>
       </w:r>
-      <w:hyperlink r:id="rId10" w:tgtFrame="_new" w:history="1">
+      <w:hyperlink r:id="rId11" w:tgtFrame="_new" w:history="1">
         <w:r>
           <w:rPr>
             <w:rStyle w:val="Kpr"/>
@@ -2332,7 +2417,7 @@
       </w:r>
     </w:p>
     <w:sectPr>
-      <w:footerReference w:type="default" r:id="rId11"/>
+      <w:footerReference w:type="default" r:id="rId12"/>
       <w:pgSz w:w="12240" w:h="15840"/>
       <w:pgMar w:top="720" w:right="720" w:bottom="777" w:left="720" w:header="0" w:footer="720" w:gutter="0"/>
       <w:cols w:space="720"/>

</xml_diff>